<commit_message>
Documenter l’assistance de Codex dans le rendu final
</commit_message>
<xml_diff>
--- a/FT_EDC-ShopWise_Bloc4-EIL.docx
+++ b/FT_EDC-ShopWise_Bloc4-EIL.docx
@@ -9985,6 +9985,40 @@
           <w:lang w:val="fr-FR"/>
         </w:rPr>
         <w:t>Pour la démonstration, lancer docker compose up --build -d, puis accéder à l’API sur http://127.0.0.1:18088. Marie (marie.dupont@shopwise.test) est ADMIN ; Lucas (lucas.martin@shopwise.test) est USER. Leur mot de passe est password. Les exemples JSON, commandes et limites figurent dans le README. H2 recharge les données initiales à chaque redémarrage.</w:t>
+      </w:r>
+    </w:p>
+    <w:p>
+      <w:pPr>
+        <w:pStyle w:val="Corps"/>
+        <w:spacing w:before="100" w:after="100" w:line="240" w:lineRule="auto"/>
+        <w:jc w:val="left"/>
+        <w:widowControl/>
+        <w:keepNext/>
+      </w:pPr>
+      <w:r>
+        <w:rPr>
+          <w:rFonts w:ascii="Calibri" w:hAnsi="Calibri"/>
+          <w:sz w:val="24"/>
+          <w:lang w:val="fr-FR"/>
+          <w:b/>
+        </w:rPr>
+        <w:t>Utilisation de Codex</w:t>
+      </w:r>
+    </w:p>
+    <w:p>
+      <w:pPr>
+        <w:pStyle w:val="Corps"/>
+        <w:spacing w:before="100" w:after="100" w:line="240" w:lineRule="auto"/>
+        <w:jc w:val="left"/>
+        <w:widowControl/>
+      </w:pPr>
+      <w:r>
+        <w:rPr>
+          <w:rFonts w:ascii="Calibri" w:hAnsi="Calibri"/>
+          <w:sz w:val="24"/>
+          <w:lang w:val="fr-FR"/>
+        </w:rPr>
+        <w:t>Ce projet et son rendu final ont été réalisés avec l’assistance de Codex, un outil d’intelligence artificielle d’OpenAI. Cette assistance a porté sur l’analyse des besoins, les propositions d’architecture, la génération et la modification de code, la préparation et l’exécution des tests, la correction de défauts, ainsi que la rédaction, la reformulation et la mise en forme des livrables. Les orientations ont été définies au fil des échanges avec l’auteur. Les résultats de validation rapportés correspondent aux vérifications décrites dans le dépôt ; l’utilisation de Codex ne constitue ni une certification de sécurité ni une garantie d’absence d’erreurs. L’auteur reste responsable du contenu remis et de sa compréhension.</w:t>
       </w:r>
     </w:p>
     <w:sectPr>

</xml_diff>